<commit_message>
week 3 hands on new2
</commit_message>
<xml_diff>
--- a/week3/HANDS ON EXPERIENCE.docx
+++ b/week3/HANDS ON EXPERIENCE.docx
@@ -19,19 +19,10 @@
           <w:sz w:val="36"/>
           <w:lang w:val="en-US"/>
         </w:rPr>
-        <w:t>HANDS ON EXPERIENCE – WEEK</w:t>
-      </w:r>
-      <w:proofErr w:type="gramStart"/>
-      <w:r>
-        <w:rPr>
-          <w:b/>
-          <w:color w:val="2F5496" w:themeColor="accent1" w:themeShade="BF"/>
-          <w:sz w:val="36"/>
-          <w:lang w:val="en-US"/>
-        </w:rPr>
-        <w:t>:2</w:t>
-      </w:r>
-      <w:proofErr w:type="gramEnd"/>
+        <w:t>HANDS ON EXPERIENCE – WEEK:3</w:t>
+      </w:r>
+      <w:bookmarkStart w:id="0" w:name="_GoBack"/>
+      <w:bookmarkEnd w:id="0"/>
     </w:p>
     <w:p>
       <w:pPr>
@@ -7799,7 +7790,6 @@
           <w:szCs w:val="28"/>
         </w:rPr>
       </w:pPr>
-      <w:bookmarkStart w:id="0" w:name="_GoBack"/>
       <w:r>
         <w:rPr>
           <w:noProof/>
@@ -7850,7 +7840,6 @@
           </wp:inline>
         </w:drawing>
       </w:r>
-      <w:bookmarkEnd w:id="0"/>
     </w:p>
     <w:p>
       <w:pPr>

</xml_diff>